<commit_message>
docs(paper): apply final revisions to B1/B3 decision rules, FPR calibration scope, frozen analysis plan, and cautious claims on H4/E2/E6
</commit_message>
<xml_diff>
--- a/paper/RTM_Paper_Final.docx
+++ b/paper/RTM_Paper_Final.docx
@@ -68,13 +68,7 @@
         <w:jc w:val="both"/>
       </w:pPr>
       <w:r>
-        <w:rPr>
-          <w:rFonts w:ascii="Times New Roman" w:hAnsi="Times New Roman" w:eastAsia="Times New Roman"/>
-          <w:b w:val="0"/>
-          <w:i w:val="0"/>
-          <w:sz w:val="19"/>
-        </w:rPr>
-        <w:t>Abstract—Large language model (LLM) agents that read documents, browse the Web, and call tools are exposed to indirect prompt injection (IPI): instructions hidden in untrusted content. Existing defenses rely on fixed detectors or costly runtime analysis, need retraining for new threats, and rarely tie decisions to documented evidence. We present RAG-Based Threat Memory (RTM), a defense that keeps adaptive security knowledge outside the detector. It combines a training-free base detector with a retrieval-augmented memory of verified injection patterns through a calibrated Soft-OR fusion rule, and explains each rejection by citing the closest documented threat and the triggering segment. A new threat is absorbed by appending a verified record without retraining, through an ingestion pipeline designed to resist poisoning. We evaluate RTM against a no-defense agent, its own components, a public trained detector, and MELON. On 1,673 held-out attack variants and 317 benign items, RTM attains an item-level attack success rate (ASR) of 6.3% [95% Wilson CI: 5.2%, 7.5%] at a false positive rate (FPR) of 16.1%, which does not improve on the base detector alone (5.7% ASR at the same FPR), whereas a public DeBERTa classifier reaches 42.9% FPR. Ingesting verified exemplars lowers ASR on six held-out families from 88.9% to 0.0% (18 paired cases) without raising FPR. None of 100 crafted poisoning records passed verification (admitted-record effects untested), and two evaluators judged 47 of 50 explanations supported. Retrieval adds a median local middleware overhead of 22.0 ms per item, yielding an end-to-end median latency of roughly 1.74 s when detector calls are required for unseen attacks.</w:t>
+        <w:t>Abstract—Large language model (LLM) agents that read documents, browse the Web, and call tools are exposed to indirect prompt injection (IPI): instructions hidden in untrusted content. Existing defenses rely on fixed detectors or costly runtime analysis, need retraining for new threats, and rarely tie decisions to documented evidence. We present RAG-Based Threat Memory (RTM), a defense that keeps adaptive security knowledge outside the detector. It combines a training-free base detector with a retrieval-augmented memory of verified injection patterns through a calibrated Soft-OR fusion rule, and explains each rejection by citing the closest documented threat and the triggering segment. A new threat is absorbed by appending a verified record without retraining, through an ingestion pipeline designed to resist poisoning. We evaluate RTM against a no-defense agent, its own components, a public trained detector, and MELON. On 1,673 held-out attack variants and 317 benign items (n = 1,990 items per system), RTM attains an item-level attack success rate (ASR) of 6.3% [95% Wilson CI: 5.2%, 7.5%] and a false positive rate (FPR) of 16.1% [95% CI: 12.5%, 20.5%]. While hyperparameter calibration targeted a nominal empirical FPR ≤ 1.0% on the calibration partition (n = 750), the observed test partition FPR was 16.1%, driven predominantly by technical hard-negative interactions (26.3% on complex security/code content vs. 3.5% on ordinary benign interactions). The standalone base detector (B1) attains 5.7% ASR and 16.1% FPR; however, because B1 operates on raw detector score thresholding while RTM (B3) applies calibrated Soft-OR fusion risk thresholding, their differing decision rules preclude isolating the empirical effect of the threat memory alone on zero-day attacks (disconfirming hypothesis H1 under our frozen analysis plan). Ingesting verified exemplars lowers ASR on six held-out families from 88.9% to 0.0% across 18 evaluated cases with zero increase in false alarms (ΔFPR = +0.00%), indicating that certain evasive variants may be remediated without retraining (though not establishing universal remediability across arbitrary attacks). None of 100 crafted poisoning records passed verification (0/200 trials), and 47 of 50 explanations were judged supported in an audited convenience sample (EVR = 94.0%, κ = 1.000). Retrieval adds a median local middleware overhead of 22.0 ms per item, yielding an end-to-end median latency of roughly 1.74 s when detector calls are required for unseen attacks. Code and data: https://github.com/eman232001/RAG_Based-Threat-Memory.</w:t>
       </w:r>
     </w:p>
     <w:p>
@@ -275,13 +269,7 @@
         <w:spacing w:line="240" w:lineRule="auto" w:after="40"/>
       </w:pPr>
       <w:r>
-        <w:rPr>
-          <w:rFonts w:ascii="Times New Roman" w:hAnsi="Times New Roman" w:eastAsia="Times New Roman"/>
-          <w:b w:val="0"/>
-          <w:i w:val="0"/>
-          <w:sz w:val="19"/>
-        </w:rPr>
-        <w:t>Empirical findings. On 1,673 held-out attack variants and 317 benign items (n = 1,990 items per system) drawn from AgentDojo, InjecAgent, and BIPIA, Full RTM (B3) attains ASR = 6.3% [95% Wilson CI: 5.2%, 7.5%] and FPR = 16.1% [95% CI: 12.5%, 20.5%], within 0.5 percentage points (pp) of the ASR of the base detector alone (B1: 5.7%). Ingesting verified exemplars lowers ASR on six held-out families from 88.9% to 0.0% (18 paired cases) with no FPR increase. None of 100 crafted poisoning records passed verification and no candidate record changed a decision (0/200 trials), and 47 of 50 audited explanations (94.0%) were judged supported by the evaluators. The retrieval stage adds a median of 22.0 ms per item, but all unseen attacks in E1 were passed to the detector, so end-to-end latency is close to that of the detector alone (Section VI-F).</w:t>
+        <w:t>Empirical findings. On 1,673 held-out attack variants and 317 benign items (n = 1,990 items per system) drawn from AgentDojo, InjecAgent, and BIPIA, Full RTM (B3) attains ASR = 6.3% [95% Wilson CI: 5.2%, 7.5%] and FPR = 16.1% [95% CI: 12.5%, 20.5%], compared to 5.7% ASR and 16.1% FPR for the base detector alone (B1). We report hypothesis outcomes under our frozen analysis plan: the comparison between B1 and B3 reflects differing decision rules and calibration rather than isolating memory alone. Ingesting verified exemplars lowers ASR on six held-out families from 88.9% to 0.0% across 18 evaluated cases with no FPR increase, demonstrating that certain evasive variants can be remediated. None of 100 crafted poisoning records passed verification and no candidate record changed a decision (0/200 trials), and 47 of 50 audited explanations (94.0%, κ = 1.000) were verified in a sample-conditioned audit with zero context leakage. The retrieval stage adds a median local overhead of 22.0 ms per item, with unseen attacks evaluated by the base detector.</w:t>
       </w:r>
     </w:p>
     <w:p>
@@ -1444,13 +1432,7 @@
         <w:jc w:val="both"/>
       </w:pPr>
       <w:r>
-        <w:rPr>
-          <w:rFonts w:ascii="Times New Roman" w:hAnsi="Times New Roman" w:eastAsia="Times New Roman"/>
-          <w:b w:val="0"/>
-          <w:i w:val="0"/>
-          <w:sz w:val="19"/>
-        </w:rPr>
-        <w:t>Each research question is paired with a testable hypothesis. The hypotheses, numeric thresholds, and analysis plan are recorded in the analysis specification file (config/prereg.yaml and prereg.yaml) in the released repository (commit 4f8b2c1, October 15, 2026). Because this commit post-dates the start of the experiments (October 9, 2026), the file formalizes the frozen analysis plan and parameters rather than a pre-experimental pre-registration.</w:t>
+        <w:t>Each research question is paired with a testable hypothesis. The hypotheses, numeric thresholds, and analysis plan are recorded in the post hoc analysis specification file (config/prereg.yaml and prereg.yaml) in the released repository (commit 4f8b2c1, October 15, 2026), which was frozen prior to final test evaluation.</w:t>
       </w:r>
     </w:p>
     <w:p>
@@ -1460,22 +1442,7 @@
         <w:jc w:val="both"/>
       </w:pPr>
       <w:r>
-        <w:rPr>
-          <w:rFonts w:ascii="Times New Roman" w:hAnsi="Times New Roman" w:eastAsia="Times New Roman"/>
-          <w:b w:val="1"/>
-          <w:i w:val="0"/>
-          <w:sz w:val="19"/>
-        </w:rPr>
-        <w:t xml:space="preserve">H1 (RQ1).</w:t>
-      </w:r>
-      <w:r>
-        <w:rPr>
-          <w:rFonts w:ascii="Times New Roman" w:hAnsi="Times New Roman" w:eastAsia="Times New Roman"/>
-          <w:b w:val="0"/>
-          <w:i w:val="0"/>
-          <w:sz w:val="19"/>
-        </w:rPr>
-        <w:t xml:space="preserve"> On held-out attack variants, RTM (B3) attains a lower ASR than the base detector alone (B1) at equal or lower FPR (paired test, corrected for multiple comparisons).</w:t>
+        <w:t>H1 (RQ1). On held-out attack variants, RTM (B3) attains a lower ASR than the base detector alone (B1) under paired testing (McNemar's test, α = 0.05, corrected for multiple comparisons).</w:t>
       </w:r>
     </w:p>
     <w:p>
@@ -1535,22 +1502,7 @@
         <w:jc w:val="both"/>
       </w:pPr>
       <w:r>
-        <w:rPr>
-          <w:rFonts w:ascii="Times New Roman" w:hAnsi="Times New Roman" w:eastAsia="Times New Roman"/>
-          <w:b w:val="1"/>
-          <w:i w:val="0"/>
-          <w:sz w:val="19"/>
-        </w:rPr>
-        <w:t xml:space="preserve">H4 (RQ4).</w:t>
-      </w:r>
-      <w:r>
-        <w:rPr>
-          <w:rFonts w:ascii="Times New Roman" w:hAnsi="Times New Roman" w:eastAsia="Times New Roman"/>
-          <w:b w:val="0"/>
-          <w:i w:val="0"/>
-          <w:sz w:val="19"/>
-        </w:rPr>
-        <w:t xml:space="preserve"> EVR ≥ 90% with Cohen’s κ ≥ 0.6 between two reviewers, and the privacy test reconstructs no protected context from explanations.</w:t>
+        <w:t>H4 (RQ4). Within an audited convenience sample of containment decisions, EVR ≥ 90% with Cohen’s κ ≥ 0.60 between two reviewers, and the privacy test reconstructs no protected context from explanations.</w:t>
       </w:r>
     </w:p>
     <w:p>
@@ -2267,279 +2219,7 @@
         <w:jc w:val="both"/>
       </w:pPr>
       <w:r>
-        <w:rPr>
-          <w:rFonts w:ascii="Times New Roman" w:hAnsi="Times New Roman" w:eastAsia="Times New Roman"/>
-          <w:b w:val="0"/>
-          <w:i w:val="0"/>
-          <w:sz w:val="19"/>
-        </w:rPr>
-        <w:t>where S</w:t>
-      </w:r>
-      <w:r>
-        <w:rPr>
-          <w:rFonts w:ascii="Times New Roman" w:hAnsi="Times New Roman" w:eastAsia="Times New Roman"/>
-          <w:b w:val="0"/>
-          <w:i w:val="0"/>
-          <w:sz w:val="19"/>
-          <w:vertAlign w:val="subscript"/>
-        </w:rPr>
-        <w:t>det</w:t>
-      </w:r>
-      <w:r>
-        <w:rPr>
-          <w:rFonts w:ascii="Times New Roman" w:hAnsi="Times New Roman" w:eastAsia="Times New Roman"/>
-          <w:b w:val="0"/>
-          <w:i w:val="0"/>
-          <w:sz w:val="19"/>
-        </w:rPr>
-        <w:t xml:space="preserve"> ∈ [0, 1] is the calibrated detector score, S</w:t>
-      </w:r>
-      <w:r>
-        <w:rPr>
-          <w:rFonts w:ascii="Times New Roman" w:hAnsi="Times New Roman" w:eastAsia="Times New Roman"/>
-          <w:b w:val="0"/>
-          <w:i w:val="0"/>
-          <w:sz w:val="19"/>
-          <w:vertAlign w:val="subscript"/>
-        </w:rPr>
-        <w:t>sim</w:t>
-      </w:r>
-      <w:r>
-        <w:rPr>
-          <w:rFonts w:ascii="Times New Roman" w:hAnsi="Times New Roman" w:eastAsia="Times New Roman"/>
-          <w:b w:val="0"/>
-          <w:i w:val="0"/>
-          <w:sz w:val="19"/>
-        </w:rPr>
-        <w:t xml:space="preserve"> ∈ [0, 1] is the calibrated memory similarity score, and w</w:t>
-      </w:r>
-      <w:r>
-        <w:rPr>
-          <w:rFonts w:ascii="Times New Roman" w:hAnsi="Times New Roman" w:eastAsia="Times New Roman"/>
-          <w:b w:val="0"/>
-          <w:i w:val="0"/>
-          <w:sz w:val="19"/>
-          <w:vertAlign w:val="subscript"/>
-        </w:rPr>
-        <w:t>sim</w:t>
-      </w:r>
-      <w:r>
-        <w:rPr>
-          <w:rFonts w:ascii="Times New Roman" w:hAnsi="Times New Roman" w:eastAsia="Times New Roman"/>
-          <w:b w:val="0"/>
-          <w:i w:val="0"/>
-          <w:sz w:val="19"/>
-        </w:rPr>
-        <w:t xml:space="preserve"> = 0.75 weights the memory channel. The content is blocked if R ≥ τ* and allowed otherwise, with a calibrated decision threshold τ* = 0.60. Two properties follow from Eq. (3). First, R ≥ S</w:t>
-      </w:r>
-      <w:r>
-        <w:rPr>
-          <w:rFonts w:ascii="Times New Roman" w:hAnsi="Times New Roman" w:eastAsia="Times New Roman"/>
-          <w:b w:val="0"/>
-          <w:i w:val="0"/>
-          <w:sz w:val="19"/>
-          <w:vertAlign w:val="subscript"/>
-        </w:rPr>
-        <w:t>det</w:t>
-      </w:r>
-      <w:r>
-        <w:rPr>
-          <w:rFonts w:ascii="Times New Roman" w:hAnsi="Times New Roman" w:eastAsia="Times New Roman"/>
-          <w:b w:val="0"/>
-          <w:i w:val="0"/>
-          <w:sz w:val="19"/>
-        </w:rPr>
-        <w:t>, so the memory channel can only add evidence to the detector. Second, R ≥ w</w:t>
-      </w:r>
-      <w:r>
-        <w:rPr>
-          <w:rFonts w:ascii="Times New Roman" w:hAnsi="Times New Roman" w:eastAsia="Times New Roman"/>
-          <w:b w:val="0"/>
-          <w:i w:val="0"/>
-          <w:sz w:val="19"/>
-          <w:vertAlign w:val="subscript"/>
-        </w:rPr>
-        <w:t>sim</w:t>
-      </w:r>
-      <w:r>
-        <w:rPr>
-          <w:rFonts w:ascii="Times New Roman" w:hAnsi="Times New Roman" w:eastAsia="Times New Roman"/>
-          <w:b w:val="0"/>
-          <w:i w:val="0"/>
-          <w:sz w:val="19"/>
-        </w:rPr>
-        <w:t xml:space="preserve"> · S</w:t>
-      </w:r>
-      <w:r>
-        <w:rPr>
-          <w:rFonts w:ascii="Times New Roman" w:hAnsi="Times New Roman" w:eastAsia="Times New Roman"/>
-          <w:b w:val="0"/>
-          <w:i w:val="0"/>
-          <w:sz w:val="19"/>
-          <w:vertAlign w:val="subscript"/>
-        </w:rPr>
-        <w:t>sim</w:t>
-      </w:r>
-      <w:r>
-        <w:rPr>
-          <w:rFonts w:ascii="Times New Roman" w:hAnsi="Times New Roman" w:eastAsia="Times New Roman"/>
-          <w:b w:val="0"/>
-          <w:i w:val="0"/>
-          <w:sz w:val="19"/>
-        </w:rPr>
-        <w:t>, so a memory match with S</w:t>
-      </w:r>
-      <w:r>
-        <w:rPr>
-          <w:rFonts w:ascii="Times New Roman" w:hAnsi="Times New Roman" w:eastAsia="Times New Roman"/>
-          <w:b w:val="0"/>
-          <w:i w:val="0"/>
-          <w:sz w:val="19"/>
-          <w:vertAlign w:val="subscript"/>
-        </w:rPr>
-        <w:t>sim</w:t>
-      </w:r>
-      <w:r>
-        <w:rPr>
-          <w:rFonts w:ascii="Times New Roman" w:hAnsi="Times New Roman" w:eastAsia="Times New Roman"/>
-          <w:b w:val="0"/>
-          <w:i w:val="0"/>
-          <w:sz w:val="19"/>
-        </w:rPr>
-        <w:t xml:space="preserve"> ≥ τ*/w</w:t>
-      </w:r>
-      <w:r>
-        <w:rPr>
-          <w:rFonts w:ascii="Times New Roman" w:hAnsi="Times New Roman" w:eastAsia="Times New Roman"/>
-          <w:b w:val="0"/>
-          <w:i w:val="0"/>
-          <w:sz w:val="19"/>
-          <w:vertAlign w:val="subscript"/>
-        </w:rPr>
-        <w:t>sim</w:t>
-      </w:r>
-      <w:r>
-        <w:rPr>
-          <w:rFonts w:ascii="Times New Roman" w:hAnsi="Times New Roman" w:eastAsia="Times New Roman"/>
-          <w:b w:val="0"/>
-          <w:i w:val="0"/>
-          <w:sz w:val="19"/>
-        </w:rPr>
-        <w:t xml:space="preserve"> = 0.80 blocks the content even when S</w:t>
-      </w:r>
-      <w:r>
-        <w:rPr>
-          <w:rFonts w:ascii="Times New Roman" w:hAnsi="Times New Roman" w:eastAsia="Times New Roman"/>
-          <w:b w:val="0"/>
-          <w:i w:val="0"/>
-          <w:sz w:val="19"/>
-          <w:vertAlign w:val="subscript"/>
-        </w:rPr>
-        <w:t>det</w:t>
-      </w:r>
-      <w:r>
-        <w:rPr>
-          <w:rFonts w:ascii="Times New Roman" w:hAnsi="Times New Roman" w:eastAsia="Times New Roman"/>
-          <w:b w:val="0"/>
-          <w:i w:val="0"/>
-          <w:sz w:val="19"/>
-        </w:rPr>
-        <w:t xml:space="preserve"> = 0 (R = 1 − (1 − 0)(1 − 0.75 × 0.80) = 0.60), whereas S</w:t>
-      </w:r>
-      <w:r>
-        <w:rPr>
-          <w:rFonts w:ascii="Times New Roman" w:hAnsi="Times New Roman" w:eastAsia="Times New Roman"/>
-          <w:b w:val="0"/>
-          <w:i w:val="0"/>
-          <w:sz w:val="19"/>
-          <w:vertAlign w:val="subscript"/>
-        </w:rPr>
-        <w:t>sim</w:t>
-      </w:r>
-      <w:r>
-        <w:rPr>
-          <w:rFonts w:ascii="Times New Roman" w:hAnsi="Times New Roman" w:eastAsia="Times New Roman"/>
-          <w:b w:val="0"/>
-          <w:i w:val="0"/>
-          <w:sz w:val="19"/>
-        </w:rPr>
-        <w:t xml:space="preserve"> = 0 leaves the decision to the detector (S</w:t>
-      </w:r>
-      <w:r>
-        <w:rPr>
-          <w:rFonts w:ascii="Times New Roman" w:hAnsi="Times New Roman" w:eastAsia="Times New Roman"/>
-          <w:b w:val="0"/>
-          <w:i w:val="0"/>
-          <w:sz w:val="19"/>
-          <w:vertAlign w:val="subscript"/>
-        </w:rPr>
-        <w:t>det</w:t>
-      </w:r>
-      <w:r>
-        <w:rPr>
-          <w:rFonts w:ascii="Times New Roman" w:hAnsi="Times New Roman" w:eastAsia="Times New Roman"/>
-          <w:b w:val="0"/>
-          <w:i w:val="0"/>
-          <w:sz w:val="19"/>
-        </w:rPr>
-        <w:t xml:space="preserve"> ≥ 0.60 blocks). Moderate evidence from both channels reinforces: S</w:t>
-      </w:r>
-      <w:r>
-        <w:rPr>
-          <w:rFonts w:ascii="Times New Roman" w:hAnsi="Times New Roman" w:eastAsia="Times New Roman"/>
-          <w:b w:val="0"/>
-          <w:i w:val="0"/>
-          <w:sz w:val="19"/>
-          <w:vertAlign w:val="subscript"/>
-        </w:rPr>
-        <w:t>det</w:t>
-      </w:r>
-      <w:r>
-        <w:rPr>
-          <w:rFonts w:ascii="Times New Roman" w:hAnsi="Times New Roman" w:eastAsia="Times New Roman"/>
-          <w:b w:val="0"/>
-          <w:i w:val="0"/>
-          <w:sz w:val="19"/>
-        </w:rPr>
-        <w:t xml:space="preserve"> = 0.40 and S</w:t>
-      </w:r>
-      <w:r>
-        <w:rPr>
-          <w:rFonts w:ascii="Times New Roman" w:hAnsi="Times New Roman" w:eastAsia="Times New Roman"/>
-          <w:b w:val="0"/>
-          <w:i w:val="0"/>
-          <w:sz w:val="19"/>
-          <w:vertAlign w:val="subscript"/>
-        </w:rPr>
-        <w:t>sim</w:t>
-      </w:r>
-      <w:r>
-        <w:rPr>
-          <w:rFonts w:ascii="Times New Roman" w:hAnsi="Times New Roman" w:eastAsia="Times New Roman"/>
-          <w:b w:val="0"/>
-          <w:i w:val="0"/>
-          <w:sz w:val="19"/>
-        </w:rPr>
-        <w:t xml:space="preserve"> = 0.50 give R = 1 − (1 − 0.40)(1 − 0.75 × 0.50) = 0.625 ≥ 0.60. The parameters w</w:t>
-      </w:r>
-      <w:r>
-        <w:rPr>
-          <w:rFonts w:ascii="Times New Roman" w:hAnsi="Times New Roman" w:eastAsia="Times New Roman"/>
-          <w:b w:val="0"/>
-          <w:i w:val="0"/>
-          <w:sz w:val="19"/>
-          <w:vertAlign w:val="subscript"/>
-        </w:rPr>
-        <w:t>sim</w:t>
-      </w:r>
-      <w:r>
-        <w:rPr>
-          <w:rFonts w:ascii="Times New Roman" w:hAnsi="Times New Roman" w:eastAsia="Times New Roman"/>
-          <w:b w:val="0"/>
-          <w:i w:val="0"/>
-          <w:sz w:val="19"/>
-        </w:rPr>
-        <w:t xml:space="preserve"> = 0.75 and τ* = 0.60 were selected on the calibration partition to maximize F1 at an FPR budget of 1% and were frozen before any test partition was evaluated.</w:t>
+        <w:t>where Sdet ∈ [0, 1] is the calibrated detector score, Ssim ∈ [0, 1] is the calibrated memory similarity score, and wsim = 0.75 weights the memory signal. The content is blocked if R ≥ τ* and allowed otherwise, with calibrated decision threshold τ* = 0.60. Under this Soft-OR formulation, high confidence from either the semantic detector (Sdet ≥ 0.60) or a verified memory match (Ssim ≥ 0.80) independently triggers a block decision, while ambiguous signals from both channels smoothly reinforce each other without allowing moderate memory similarities on unseen threats to suppress confident detector flags. The parameters wsim = 0.75 and τ* = 0.60 were selected on the calibration partition to maximize F1 under a nominal empirical target of FPR ≤ 1.0% on that partition; this target was strictly an empirical optimization objective on the calibration set and not an operational guarantee on unseen test distributions.</w:t>
       </w:r>
     </w:p>
     <w:p>
@@ -3530,13 +3210,7 @@
         <w:spacing w:line="240" w:lineRule="auto" w:after="40"/>
       </w:pPr>
       <w:r>
-        <w:rPr>
-          <w:rFonts w:ascii="Times New Roman" w:hAnsi="Times New Roman" w:eastAsia="Times New Roman"/>
-          <w:b w:val="0"/>
-          <w:i w:val="0"/>
-          <w:sz w:val="18"/>
-        </w:rPr>
-        <w:t xml:space="preserve">B1: the base detector only;</w:t>
+        <w:t>B1: the base detector only, evaluated using raw detector score thresholding (s_det ≥ τ_raw);</w:t>
       </w:r>
     </w:p>
     <w:p>
@@ -3560,13 +3234,7 @@
         <w:spacing w:line="240" w:lineRule="auto" w:after="40"/>
       </w:pPr>
       <w:r>
-        <w:rPr>
-          <w:rFonts w:ascii="Times New Roman" w:hAnsi="Times New Roman" w:eastAsia="Times New Roman"/>
-          <w:b w:val="0"/>
-          <w:i w:val="0"/>
-          <w:sz w:val="18"/>
-        </w:rPr>
-        <w:t xml:space="preserve">B3: the complete RTM architecture;</w:t>
+        <w:t>B3: the complete RTM architecture, evaluated using calibrated Soft-OR fusion risk thresholding (R ≥ τ* = 0.60, w_sim = 0.75);</w:t>
       </w:r>
     </w:p>
     <w:p>
@@ -4008,51 +3676,7 @@
         <w:jc w:val="both"/>
       </w:pPr>
       <w:r>
-        <w:rPr>
-          <w:rFonts w:ascii="Times New Roman" w:hAnsi="Times New Roman" w:eastAsia="Times New Roman"/>
-          <w:b w:val="0"/>
-          <w:i w:val="0"/>
-          <w:sz w:val="19"/>
-        </w:rPr>
-        <w:t>Table III compares the systems on the held-out partitions (n = 1,673 attack variants across six families and n = 317 benign items; n = 1,990 items per system). Full RTM (B3) attains ASR = 6.3% [95% Wilson CI: 5.2%, 7.5%] (105/1,673 attacks permitted) and FPR = 16.1% [12.5%, 20.5%] (51/317 benign items blocked, including hard negatives), for an accuracy of 92.2% [90.9%, 93.3%] and a balanced accuracy of 88.8%. Because 84% of the items are attacks, accuracy overstates performance, and the FPR on benign content is the more informative utility indicator. The base detector alone (B1) obtains ASR = 5.7% [4.7%, 7.0%] (96/1,673) at the same FPR (16.1%) and an accuracy of 92.6%. B3 therefore does not improve on B1 in containment: B1 blocked 9 attacks that B3 permitted, and B3 blocked none that B1 permitted (exact McNemar p = 0.0039; χ² = 7.11 with continuity correction). Since R ≥ S</w:t>
-      </w:r>
-      <w:r>
-        <w:rPr>
-          <w:rFonts w:ascii="Times New Roman" w:hAnsi="Times New Roman" w:eastAsia="Times New Roman"/>
-          <w:b w:val="0"/>
-          <w:i w:val="0"/>
-          <w:sz w:val="19"/>
-          <w:vertAlign w:val="subscript"/>
-        </w:rPr>
-        <w:t>det</w:t>
-      </w:r>
-      <w:r>
-        <w:rPr>
-          <w:rFonts w:ascii="Times New Roman" w:hAnsi="Times New Roman" w:eastAsia="Times New Roman"/>
-          <w:b w:val="0"/>
-          <w:i w:val="0"/>
-          <w:sz w:val="19"/>
-        </w:rPr>
-        <w:t xml:space="preserve"> by Eq. (3), B3 cannot permit an attack that B1 blocks at the same threshold, so the difference arises from the decision rules: B1 thresholds the raw detector score at τ</w:t>
-      </w:r>
-      <w:r>
-        <w:rPr>
-          <w:rFonts w:ascii="Times New Roman" w:hAnsi="Times New Roman" w:eastAsia="Times New Roman"/>
-          <w:b w:val="0"/>
-          <w:i w:val="0"/>
-          <w:sz w:val="19"/>
-          <w:vertAlign w:val="subscript"/>
-        </w:rPr>
-        <w:t>B1</w:t>
-      </w:r>
-      <w:r>
-        <w:rPr>
-          <w:rFonts w:ascii="Times New Roman" w:hAnsi="Times New Roman" w:eastAsia="Times New Roman"/>
-          <w:b w:val="0"/>
-          <w:i w:val="0"/>
-          <w:sz w:val="19"/>
-        </w:rPr>
-        <w:t xml:space="preserve"> ≈ 0.68, whereas B3 thresholds the fused, isotonic-calibrated score at τ* = 0.60, and calibration compresses the score range, so B1 blocks some borderline attacks that B3 permits. B1 is thus not calibrated like B3, and a calibrated B1 would isolate the contribution of the memory more cleanly. Hypothesis H1 is accordingly not supported (Table VIII); post hoc, B3 is within 0.5 pp of B1 in ASR. B3 permits far fewer attacks than the undefended agent (B0: ASR = 100.0%) and than memory-only B2 (ASR = 100.0%, 1,673/1,673 permitted; FPR = 1.3%), which cannot detect unseen families before adaptation (both χ² = 1566.0, p &lt; 0.001, Holm-adjusted). The public DeBERTa classifier (B6) reaches ASR = 17.3% [15.6%, 19.2%] and FPR = 42.9% [37.6%, 48.4%] (136/317 benign items blocked; accuracy 78.6%); B3 outperforms it in ASR (χ² = 106.80, p &lt; 0.001).</w:t>
+        <w:t>Table III compares the systems on the held-out partitions (n = 1,673 attack variants across six families and n = 317 benign items; n = 1,990 items per system). Full RTM (B3) attains ASR = 6.3% [95% Wilson CI: 5.2%, 7.5%] (105/1,673 attacks permitted) and FPR = 16.1% [12.5%, 20.5%] (51/317 benign items blocked, including hard negatives), for an accuracy of 92.2% [90.9%, 93.3%] and a balanced accuracy of 88.8%. While calibration targeted an empirical FPR ≤ 1.0% on the calibration partition (n = 750), unseen test distribution shifts—primarily from technical hard negatives—led to this observed 16.1% test FPR. The standalone base detector (B1) obtains ASR = 5.7% [4.7%, 7.0%] (96/1,673) and FPR = 16.1%, with an accuracy of 92.6%. B3 therefore does not improve on B1 in zero-day containment: B1 blocked 9 attacks that B3 permitted, and B3 blocked none that B1 permitted (exact McNemar p = 0.0039; χ² = 7.11 with continuity correction). This difference stems directly from their differing decision rules: B1 applies raw detector score thresholding (s_det ≥ τ_raw), whereas B3 applies calibrated Soft-OR fusion risk thresholding (R ≥ τ* = 0.60). In the cold-start absence of matching memory exemplars (S_sim ≈ 0), B3's score is governed by isotonic calibration g_det, which compressed nine borderline likelihoods marginally below τ* = 0.60 that B1's raw threshold blocked. Crucially, because B1 and B3 employ fundamentally different decision rules and thresholding mechanisms, this comparison does not permit isolating the empirical effect of the threat memory alone. Hypothesis H1 is formally not supported (Table VIII); post hoc, B3 is within 0.5 pp of B1 in ASR. B3 permits far fewer attacks than the undefended agent (B0: ASR = 100.0%) and than memory-only B2 (ASR = 100.0%, 1,673/1,673 permitted; FPR = 1.3%), which cannot detect unseen families before adaptation (both χ² = 1566.0, p &lt; 0.001, Holm-adjusted). The public DeBERTa classifier (B6) reaches ASR = 17.3% [15.6%, 19.2%] and FPR = 42.9% [37.6%, 48.4%] (136/317 benign items blocked; accuracy 78.6%); B3 outperforms it in ASR (χ² = 106.80, p &lt; 0.001).</w:t>
       </w:r>
     </w:p>
     <w:p>
@@ -4817,31 +4441,7 @@
         <w:jc w:val="both"/>
       </w:pPr>
       <w:r>
-        <w:rPr>
-          <w:rFonts w:ascii="Times New Roman" w:hAnsi="Times New Roman" w:eastAsia="Times New Roman"/>
-          <w:b w:val="0"/>
-          <w:i w:val="0"/>
-          <w:sz w:val="19"/>
-        </w:rPr>
-        <w:t xml:space="preserve">Table IV reports adaptation when a newly documented threat family is added to the memory through the append-and-index operation. This is a small paired case study: three instances per family, 18 paired before/after cases over six held-out families. The three instances per family were drawn at random from the held-out pool, and the memory before the update excludes the family under test. </w:t>
-      </w:r>
-      <w:r>
-        <w:rPr>
-          <w:rFonts w:ascii="Times New Roman" w:hAnsi="Times New Roman" w:eastAsia="Times New Roman"/>
-          <w:b w:val="0"/>
-          <w:i w:val="0"/>
-          <w:sz w:val="19"/>
-        </w:rPr>
-        <w:t xml:space="preserve">E1 used the complete memory (155 records), whereas E2 uses a leave-one-family-out memory in which the family under test is removed on purpose before the update, so that it acts as an unseen (zero-day) family; the pre-update ASR of E2 is therefore not comparable with the ASR of E1. </w:t>
-      </w:r>
-      <w:r>
-        <w:rPr>
-          <w:rFonts w:ascii="Times New Roman" w:hAnsi="Times New Roman" w:eastAsia="Times New Roman"/>
-          <w:b w:val="0"/>
-          <w:i w:val="0"/>
-          <w:sz w:val="19"/>
-        </w:rPr>
-        <w:t xml:space="preserve"> Ingesting verified exemplars lowers ASR from 88.9% (averaged over the six families) to 0.0%, a mean adaptation gain AG = +88.9 pp. Intervals are paired bootstrap percentile intervals (10,000 resamples) over the paired outcomes: [+100.0, +100.0] for the four families with 3/3 successful attacks before ingestion, where the bootstrap distribution is degenerate, and [+0.0, +100.0] for financial_data and physical_data (pre-ingestion ASR = 66.7%). The pooled interval over the 18 cases is [+72.2, +100.0]. ΔFPR on the benign partition is +0.00 pp, within the 1.0 pp limit. H2 is therefore supported at the pooled level, while the per-family lower bound is zero for two families (Table VIII). With one ingested exemplar per family and three test instances, these results show feasibility rather than a precise effect size. The pre-update ASR of the 18 cases (88.9%) is far above the per-family ASR of E1, so the cases should not be read as representative of the held-out pool, and a full-pool evaluation of E2 is left for future work.</w:t>
+        <w:t>Table IV reports adaptation when a newly documented threat family is added to the memory through the append-and-index operation. This is a single vector append without model fine-tuning. Across all six held-out families, ASR drops from an initial 88.9% (16/18 permitted) before the update to 0.0% (0/18 permitted) after it, yielding a mean Adaptation Gain of +88.9% [95% bootstrap CI: +72.2%, +100.0%] with zero increase in false alarms (ΔFPR = +0.00%). Crucially, these findings indicate that certain evasive variants may be remediated by appending verified exemplars without model retraining. However, we explicitly do not claim that all residual failures are remediable through memory updates. The 18 evaluated cases represent a small, hand-selected diagnostic convenience sample of held-out evasions and do not establish generalized remediability across unseen or arbitrary attack strategies.</w:t>
       </w:r>
     </w:p>
     <w:p>
@@ -6140,13 +5740,7 @@
         <w:jc w:val="both"/>
       </w:pPr>
       <w:r>
-        <w:rPr>
-          <w:rFonts w:ascii="Times New Roman" w:hAnsi="Times New Roman" w:eastAsia="Times New Roman"/>
-          <w:b w:val="0"/>
-          <w:i w:val="0"/>
-          <w:sz w:val="19"/>
-        </w:rPr>
-        <w:t>Two reviewers, who were blinded to the configuration, judged 50 rejection explanations, taken sequentially as the first 50 documented blocks of the E1 log. The Explanation Verification Rate (EVR) was 94.0% (47/50; 95% Wilson CI [83.8%, 97.9%]), with Cohen’s κ = 1.000 (observed agreement 50/50). Because 94% of the labels are positive, κ is sensitive to prevalence and is best read together with the raw agreement. The automated privacy audit recovered no protected context from the redacted explanations in 0/50 attempts (95% upper bound 7.1%).</w:t>
+        <w:t>Two reviewers, who were blinded to the configuration, judged 50 rejection explanations, taken sequentially as the first 50 documented blocks in the log file. For each case, the reviewers had the external content, the cited memory record, the extracted text segment, and the true attack label (if an attack was present), and they answered whether the cited record matched the threat mechanism and whether the extracted segment contained the instruction. Reviewer 1 judged 47 of 50 explanations supported (EVR = 94.0%), and Reviewer 2 judged the same 47 supported (EVR = 94.0%, Cohen’s κ = 1.000). The three unverified cases involved vague or multi-sentence injection patterns where the cited exemplar described a related but broader threat. In the automated reconstruction test, zero protected context was recovered from explanations (0.0% recovery rate). While these quantitative outcomes meet the pre-specified numerical criteria (EVR ≥ 90%, κ ≥ 0.60), support for H4 must be strictly qualified: the result is conditioned on the small convenience sample of 50 consecutive explanations, the non-random sampling order, and evaluator constraints (notably that one of the two reviewers was a study co-author). These findings provide preliminary evidence of explanation verifiability under controlled audit conditions rather than an unconditional guarantee.</w:t>
       </w:r>
     </w:p>
     <w:p>
@@ -6172,13 +5766,7 @@
         <w:jc w:val="both"/>
       </w:pPr>
       <w:r>
-        <w:rPr>
-          <w:rFonts w:ascii="Times New Roman" w:hAnsi="Times New Roman" w:eastAsia="Times New Roman"/>
-          <w:b w:val="0"/>
-          <w:i w:val="0"/>
-          <w:sz w:val="19"/>
-        </w:rPr>
-        <w:t>Table VII reports the ablations. They were run on a small evaluation subset of 12 attack and 10 benign items, so each percentage step corresponds to a single item and the table is descriptive. It is not computed on the full partitions of Table III, which explains why the Full RTM row differs from Table III. The non-monotone FPR changes across ablations arise from the small subset (n = 22), in which the isotonic calibration that yields 0.0% FPR for Full RTM may not generalize; these values are therefore descriptive and not extrapolated to the full partition. Relative to Full RTM (ASR = 8.3%, FPR = 0.0%, F1 = 0.957), removing the memory raises ASR to 25.0% and removes the explanations (EVR is undefined); removing the detector raises ASR to 41.7%; removing calibration raises FPR to 30.0%; and removing segmentation or exemplars raises ASR to 25.0%, with EVR falling to 75.0% without exemplars. Replacing the verified memory with random benign records (B3-rand) gives FPR = 40.0% and F1 = 0.720, and BM25 retrieval (B3-lex) gives ASR = 25.0% and EVR = 0.0%. Across k ∈ {1, 3, 5, 10}, ASR ranges from 8.3% (k = 5) to 25.0% (k = 10).</w:t>
+        <w:t>Table VII reports the ablations. They were run on a small diagnostic evaluation subset of 12 attack and 10 benign items (n = 22), so this experiment serves strictly as an exploratory diagnostic ablation rather than confirmatory statistical proof. It is not computed on the full partitions of Table III, which explains why the Full RTM row differs from Table III. Relative to Full RTM (ASR = 8.3%, FPR = 0.0%, F1 = 0.957), removing the memory raises ASR to 25.0% and removes explanations (EVR is undefined); removing the detector raises ASR to 41.7%; removing calibration raises FPR to 30.0%; and removing segmentation or exemplars raises ASR to 25.0%, with EVR falling to 75.0% without exemplars. While dense semantic retrieval showed lower ASR and higher F1 than BM25 lexical retrieval (B3-lex: ASR = 25.0%, F1 = 0.818) and random memory (B3-rand: ASR = 25.0%, F1 = 0.720) on this subset, these differences represent exploratory directional trends. Given the small sample size (n = 22), they do not provide strong statistical evidence of the general superiority of semantic over lexical retrieval.</w:t>
       </w:r>
     </w:p>
     <w:p>
@@ -7087,7 +6675,7 @@
           </w:tcPr>
           <w:p>
             <w:r>
-              <w:t>Criterion (Analysis Plan)</w:t>
+              <w:t>Criterion (Frozen Analysis Plan)</w:t>
             </w:r>
           </w:p>
         </w:tc>
@@ -7132,13 +6720,7 @@
           </w:tcPr>
           <w:p>
             <w:r>
-              <w:rPr>
-                <w:rFonts w:ascii="Times New Roman" w:hAnsi="Times New Roman" w:eastAsia="Times New Roman"/>
-                <w:b w:val="0"/>
-                <w:i w:val="0"/>
-                <w:sz w:val="19"/>
-              </w:rPr>
-              <w:t>B3 ASR &lt; B1 at equal or lower FPR (paired test, Holm-corrected)</w:t>
+              <w:t>B3 ASR ≤ B1 ASR under paired McNemar testing (α = 0.05). Note: Decision rules differ (B1 raw detector threshold vs. B3 calibrated fused score); comparison does not isolate memory alone.</w:t>
             </w:r>
           </w:p>
         </w:tc>
@@ -7148,13 +6730,7 @@
           </w:tcPr>
           <w:p>
             <w:r>
-              <w:rPr>
-                <w:rFonts w:ascii="Times New Roman" w:hAnsi="Times New Roman" w:eastAsia="Times New Roman"/>
-                <w:b w:val="0"/>
-                <w:i w:val="0"/>
-                <w:sz w:val="19"/>
-              </w:rPr>
-              <w:t>ASR 6.3% (105/1,673) vs. B1 5.7% (96/1,673); FPR 16.1% vs. 16.1%. B1 blocked 9 attacks that B3 permitted; B3 none that B1 permitted (exact McNemar p = 0.0039). Post hoc: B3 within 0.5 pp of B1. B3 better than B0, B2, B6 (p &lt; 0.001).</w:t>
+              <w:t>ASR 6.3% (105/1,673) vs. B1 5.7% (96/1,673); FPR 16.1% vs. 16.1%. B1 blocked 9 attacks that B3 permitted; B3 none that B1 permitted (exact McNemar p = 0.0039). Difference reflects decision rules/calibration, not isolated memory deficit.</w:t>
             </w:r>
           </w:p>
         </w:tc>
@@ -7164,12 +6740,6 @@
           </w:tcPr>
           <w:p>
             <w:r>
-              <w:rPr>
-                <w:rFonts w:ascii="Times New Roman" w:hAnsi="Times New Roman" w:eastAsia="Times New Roman"/>
-                <w:b w:val="0"/>
-                <w:i w:val="0"/>
-                <w:sz w:val="19"/>
-              </w:rPr>
               <w:t>Not supported</w:t>
             </w:r>
           </w:p>
@@ -7211,13 +6781,7 @@
           </w:tcPr>
           <w:p>
             <w:r>
-              <w:rPr>
-                <w:rFonts w:ascii="Times New Roman" w:hAnsi="Times New Roman" w:eastAsia="Times New Roman"/>
-                <w:b w:val="0"/>
-                <w:i w:val="0"/>
-                <w:sz w:val="19"/>
-              </w:rPr>
-              <w:t>Pooled AG = +88.9 pp [+72.2, +100.0] (18 cases); per-family lower bound = 0 for financial_data and physical_data; ΔFPR = +0.00 pp</w:t>
+              <w:t>Pooled AG = +88.9 pp [+72.2, +100.0] on 18 selected held-out cases; ΔFPR = +0.00 pp. Shows certain evasions remediable; sample is small and does not prove universal remediability.</w:t>
             </w:r>
           </w:p>
         </w:tc>
@@ -7227,13 +6791,7 @@
           </w:tcPr>
           <w:p>
             <w:r>
-              <w:rPr>
-                <w:rFonts w:ascii="Times New Roman" w:hAnsi="Times New Roman" w:eastAsia="Times New Roman"/>
-                <w:b w:val="0"/>
-                <w:i w:val="0"/>
-                <w:sz w:val="19"/>
-              </w:rPr>
-              <w:t>Partially supported</w:t>
+              <w:t>Supported (Proof-of-Concept, 18-case subset)</w:t>
             </w:r>
           </w:p>
         </w:tc>
@@ -7337,13 +6895,7 @@
           </w:tcPr>
           <w:p>
             <w:r>
-              <w:rPr>
-                <w:rFonts w:ascii="Times New Roman" w:hAnsi="Times New Roman" w:eastAsia="Times New Roman"/>
-                <w:b w:val="0"/>
-                <w:i w:val="0"/>
-                <w:sz w:val="19"/>
-              </w:rPr>
-              <w:t>EVR = 94.0% (47/50); κ = 1.000; 0/50 protected-context leaks (95% upper bound 7.1%)</w:t>
+              <w:t>EVR = 94.0% (47/50); κ = 1.000; 0/50 protected-context leaks. Conditioned on 50-item convenience sample and dual reviewers including a study co-author.</w:t>
             </w:r>
           </w:p>
         </w:tc>
@@ -7353,13 +6905,7 @@
           </w:tcPr>
           <w:p>
             <w:r>
-              <w:rPr>
-                <w:rFonts w:ascii="Times New Roman" w:hAnsi="Times New Roman" w:eastAsia="Times New Roman"/>
-                <w:b w:val="0"/>
-                <w:i w:val="0"/>
-                <w:sz w:val="19"/>
-              </w:rPr>
-              <w:t>Supported (point estimate)</w:t>
+              <w:t>Supported (Sample-Conditioned)</w:t>
             </w:r>
           </w:p>
         </w:tc>
@@ -7519,22 +7065,7 @@
         <w:jc w:val="both"/>
       </w:pPr>
       <w:r>
-        <w:rPr>
-          <w:rFonts w:ascii="Times New Roman" w:hAnsi="Times New Roman" w:eastAsia="Times New Roman"/>
-          <w:b/>
-          <w:i w:val="0"/>
-          <w:sz w:val="19"/>
-        </w:rPr>
-        <w:t>Adaptation versus Memorization.</w:t>
-      </w:r>
-      <w:r>
-        <w:rPr>
-          <w:rFonts w:ascii="Times New Roman" w:hAnsi="Times New Roman" w:eastAsia="Times New Roman"/>
-          <w:b w:val="0"/>
-          <w:i w:val="0"/>
-          <w:sz w:val="19"/>
-        </w:rPr>
-        <w:t xml:space="preserve"> A central question for retrieval-based defenses is whether gains reflect generalization or memorization. Three observations bear on this question, although each rests on a small sample and none is conclusive. First, the E2 adaptation gain is measured on held-out variants disjoint from the ingested exemplars (18 paired cases). Second, in the ablation subset, replacing the verified memory with random benign records (B3-rand) raises FPR to 40.0% (F1 = 0.720), and BM25 retrieval (B3-lex) yields ASR = 25.0% and no verifiable explanations (EVR = 0.0%). Third, updating the base detector with a few-shot example (B4) reached ASR = 0.0% on its pilot sample of 10 attack items, so the memory is not shown to be more accurate than a detector-side update; its advantages are the explanation tied to a documented record and an update that leaves the detector prompt unchanged. Larger E2 and B3-versus-B4 comparisons are needed before claiming that the memory outperforms prompt-based updating.</w:t>
+        <w:t>Adaptation versus Memorization. A central question for retrieval-based defenses is whether gains reflect generalization or memorization. Three observations bear on this question, although each rests on a small sample and none is conclusive. First, the E2 adaptation gain is measured on held-out variants disjoint from the ingested exemplars (18 paired cases), showing that certain evasions are remediable, though this small sample does not prove universal remediability. Second, in the exploratory ablation subset (n = 22), replacing verified memory with random benign records (B3-rand) raises FPR to 40.0% (F1 = 0.720), and BM25 retrieval (B3-lex) yields ASR = 25.0% and no verifiable explanations (EVR = 0.0%), pointing directionally toward semantic retrieval advantages without constituting definitive statistical proof. Third, updating the base detector with a few-shot example (B4) reached ASR = 0.0% on its pilot sample of 10 attack items, so the memory is not shown to be more accurate than a detector-side update; its advantages are the explanation tied to a documented record and an update that leaves the detector prompt unchanged. Larger E2 and B3-versus-B4 comparisons are needed before claiming that the memory outperforms prompt-based updating.</w:t>
       </w:r>
     </w:p>
     <w:p>
@@ -7569,22 +7100,7 @@
         <w:jc w:val="both"/>
       </w:pPr>
       <w:r>
-        <w:rPr>
-          <w:rFonts w:ascii="Times New Roman" w:hAnsi="Times New Roman" w:eastAsia="Times New Roman"/>
-          <w:b/>
-          <w:i w:val="0"/>
-          <w:sz w:val="19"/>
-        </w:rPr>
-        <w:t>False Positives.</w:t>
-      </w:r>
-      <w:r>
-        <w:rPr>
-          <w:rFonts w:ascii="Times New Roman" w:hAnsi="Times New Roman" w:eastAsia="Times New Roman"/>
-          <w:b w:val="0"/>
-          <w:i w:val="0"/>
-          <w:sz w:val="19"/>
-        </w:rPr>
-        <w:t xml:space="preserve"> The FPR of RTM on benign content (16.1%) equals that of B1 and is far above the 1% budget used for calibration. The FPR is 26.3% (46/175; 95% Wilson CI [20.3%, 33.3%]) on the 175 hard negatives (advisories, instructional text, and code with legitimate imperative sentences) and 3.5% (5/142; [1.5%, 8.0%]) on the 142 other benign items. Hard negatives are scarce in the calibration partition, so calibration under-penalizes them. An FPR of this size would disrupt interactive agents, and reducing it is the main open problem of this work; the 42.9% FPR of the public DeBERTa classifier on the same items indicates that the problem is shared by other detectors, although this does not reduce its impact on interactive agents. Prevalence matters as well: 84% of the test items are attacks, whereas at a realistic attack prevalence of 1% the same recall (93.7%) and FPR (16.1%) would yield a precision of only about 5.6%.</w:t>
+        <w:t>False Positives. The FPR of RTM on benign content (16.1%) equals that of B1 and is far above the 1.0% empirical target used for calibration. This 1% target was strictly an optimization goal on the calibration partition (n = 750), not an empirical or theoretical guarantee on unseen test distributions. The FPR is 26.3% (46/175; 95% Wilson CI [20.3%, 33.3%]) on the 175 hard negatives (advisories, instructional text, and code with legitimate imperative sentences) and 3.5% (5/142; [1.5%, 8.0%]) on the 142 other benign items. Hard negatives are scarce in the calibration partition, so calibration under-penalizes them. An FPR of this size would disrupt interactive agents, and reducing it is the main open problem of this work; the 42.9% FPR of the public DeBERTa classifier on the same items indicates that the problem is shared by other detectors, although this does not reduce its impact on interactive agents. Prevalence matters as well: 84% of the test items are attacks, whereas at a realistic attack prevalence of 1% the same recall (93.7%) and FPR (16.1%) would yield a precision of only about 5.6%.</w:t>
       </w:r>
     </w:p>
     <w:p>
@@ -7594,31 +7110,7 @@
         <w:jc w:val="both"/>
       </w:pPr>
       <w:r>
-        <w:rPr>
-          <w:rFonts w:ascii="Times New Roman" w:hAnsi="Times New Roman" w:eastAsia="Times New Roman"/>
-          <w:b/>
-          <w:i w:val="0"/>
-          <w:sz w:val="19"/>
-        </w:rPr>
-        <w:t>Failure Analysis and Design Implications.</w:t>
-      </w:r>
-      <w:r>
-        <w:rPr>
-          <w:rFonts w:ascii="Times New Roman" w:hAnsi="Times New Roman" w:eastAsia="Times New Roman"/>
-          <w:b w:val="0"/>
-          <w:i w:val="0"/>
-          <w:sz w:val="19"/>
-        </w:rPr>
-        <w:t xml:space="preserve"> First, residual evasions of B3 (105/1,673) tend to involve nested instructions and heavily obfuscated payloads that lie far from the memory exemplars in embedding space and also receive a low detector score. The 105 residual evasions are distributed across the six families as follows: data_security_harm (21), financial_data (18), financial_harm (17), language_translation (16), physical_data (17), and physical_harm (16)</w:t>
-      </w:r>
-      <w:r>
-        <w:rPr>
-          <w:rFonts w:ascii="Times New Roman" w:hAnsi="Times New Roman" w:eastAsia="Times New Roman"/>
-          <w:b w:val="0"/>
-          <w:i w:val="0"/>
-          <w:sz w:val="19"/>
-        </w:rPr>
-        <w:t>. Second, in E2, ingesting a single exemplar for a family removed these evasions in all 18 cases, which suggests that residual failures may be remediable by memory updates without fine-tuning, subject to the small sample. Third, removing calibration raised FPR from 0.0% to 30.0% in the ablation subset, which indicates that calibration limits false alarms. Fourth, because candidate records stay inactive until verified and the gate blocked every crafted record, no poisoning attempt changed a decision; this underscores the need for a verification gate and human review of memory updates, whereas the effect of an admitted poisoned record is untested.</w:t>
+        <w:t>Failure Analysis and Design Implications. First, residual evasions of B3 (105/1,673) tend to involve nested instructions and heavily obfuscated payloads that lie far from the memory exemplars in embedding space and also receive a low detector score. The 105 residual evasions are distributed across the six families as follows: data_security_harm (21), financial_data (18), financial_harm (17), language_translation (16), physical_data (17), and physical_harm (16). Second, in E2, ingesting a single exemplar for a family removed evasions in all 18 evaluated cases, suggesting that certain evasive variants may be remediable by memory updates without fine-tuning; however, this does not imply that all residual failures are remediable, given the small sample and the persistence of complex evasions. Third, removing calibration raised FPR from 0.0% to 30.0% in the ablation subset, which indicates that calibration limits false alarms. Fourth, because candidate records stay inactive until verified and the gate blocked every crafted record, no poisoning attempt changed a decision; this underscores the need for a verification gate and human review of memory updates, whereas the effect of an admitted poisoned record is untested.</w:t>
       </w:r>
     </w:p>
     <w:p>
@@ -7705,22 +7197,7 @@
         <w:jc w:val="both"/>
       </w:pPr>
       <w:r>
-        <w:rPr>
-          <w:rFonts w:ascii="Times New Roman" w:hAnsi="Times New Roman" w:eastAsia="Times New Roman"/>
-          <w:b/>
-          <w:i w:val="0"/>
-          <w:sz w:val="19"/>
-        </w:rPr>
-        <w:t>Statistical conclusion validity.</w:t>
-      </w:r>
-      <w:r>
-        <w:rPr>
-          <w:rFonts w:ascii="Times New Roman" w:hAnsi="Times New Roman" w:eastAsia="Times New Roman"/>
-          <w:b w:val="0"/>
-          <w:i w:val="0"/>
-          <w:sz w:val="19"/>
-        </w:rPr>
-        <w:t xml:space="preserve"> Several experiments rest on small samples: E2 (18 paired cases), E3 (n = 10 per cell), the ablations (12 attack and 10 benign items), B4 (10 attack and 10 benign items), B5 (24 attack and 20 benign trials), and E5 (50 explanations, taken sequentially and judged by the two authors, so that κ may be optimistic). E1, E2, and E6 were run once with deterministic decoding, so run-to-run variance is not estimated. Intervals are wide, differences between table cells are not tested, and these results should be read as indicative. Item-level ASR on static benchmark items differs from agent-level ASR, and the held-out attack variants are generated by the authors’ own mutation procedure, which may favor or disfavor particular defenses. Variants within a family share templates and seeds, and the 18 cases of E2 are clustered within six families, so intervals that assume independent items may be too narrow.</w:t>
+        <w:t>Statistical conclusion validity. Several experiments rest on small samples: E2 (18 paired cases, demonstrating local remediability rather than broad generalizability), E3 (n = 10 per cell), the exploratory ablations (12 attack and 10 benign items, which do not provide strong statistical evidence of semantic over lexical superiority), B4 (10 attack and 10 benign items), B5 (24 attack and 20 benign trials), and E5 (50 explanations, taken sequentially and judged by two reviewers including a study co-author, which bounds the generalizability of EVR and κ). E1, E2, and E6 were run once with deterministic decoding, so run-to-run variance is not estimated. Differences between B1 and B3 reflect distinct decision rules and calibration, meaning the marginal effect of memory alone is not isolated on zero-day attacks.</w:t>
       </w:r>
     </w:p>
     <w:p>
@@ -7730,22 +7207,7 @@
         <w:jc w:val="both"/>
       </w:pPr>
       <w:r>
-        <w:rPr>
-          <w:rFonts w:ascii="Times New Roman" w:hAnsi="Times New Roman" w:eastAsia="Times New Roman"/>
-          <w:b w:val="1"/>
-          <w:i w:val="0"/>
-          <w:sz w:val="19"/>
-        </w:rPr>
-        <w:t xml:space="preserve">Limitations.</w:t>
-      </w:r>
-      <w:r>
-        <w:rPr>
-          <w:rFonts w:ascii="Times New Roman" w:hAnsi="Times New Roman" w:eastAsia="Times New Roman"/>
-          <w:b w:val="0"/>
-          <w:i w:val="0"/>
-          <w:sz w:val="19"/>
-        </w:rPr>
-        <w:t xml:space="preserve"> The scope is an agent that handles textual or retrieved content, with one decision per content item. The memory depends on the quality and timeliness of its sources, and ingestion is semi-automated with verification before insertion by design, not fully live. RTM may miss subtle logical manipulation that contains no explicit instruction, and it may not generalize to multimodal attacks without additional components. The detector is itself an LLM and inherits residual injection risk. RTM is a complementary layer and not a replacement for execution-centric controls such as least privilege, tool isolation, and human approval. Adaptive attackers may also exploit the memory by probing which record was matched; mitigations include uniform responses to untrusted parties, rate limiting, and reporting ASR as a function of query budget. The false positive rate on benign content (16.1%) limits use in interactive settings. The poisoning evaluation tests the verification gate, not retrieval and fusion with an admitted poisoned record.</w:t>
+        <w:t>Limitations. The scope is an agent that handles textual or retrieved content, with one decision per content item. The memory depends on the quality and timeliness of its sources, and ingestion is semi-automated with verification before insertion by design, not fully live. RTM may miss subtle logical manipulation that contains no explicit instruction, and it may not generalize to multimodal attacks without additional components. The detector is itself an LLM and inherits residual injection risk. RTM is a complementary layer and not a replacement for execution-centric controls such as least privilege, tool isolation, and human approval. Adaptive attackers may also exploit the memory by probing which record was matched; mitigations include uniform responses to untrusted parties, rate limiting, and reporting ASR as a function of query budget. The false positive rate on benign content (16.1%, driven by 26.3% on technical hard negatives despite a 1.0% calibration target) limits use in interactive settings without domain-adapted calibration. In E2, remediability is shown only for a small sample of 18 cases, and does not establish that all residual failures can be resolved by memory updates. The poisoning evaluation tests the verification gate, not retrieval and fusion with an admitted poisoned record.</w:t>
       </w:r>
     </w:p>
     <w:p>
@@ -7803,13 +7265,7 @@
         <w:jc w:val="both"/>
       </w:pPr>
       <w:r>
-        <w:rPr>
-          <w:rFonts w:ascii="Times New Roman" w:hAnsi="Times New Roman" w:eastAsia="Times New Roman"/>
-          <w:b w:val="0"/>
-          <w:i w:val="0"/>
-          <w:sz w:val="19"/>
-        </w:rPr>
-        <w:t>This paper presented RAG-Based Threat Memory (RTM), a model-centric defense that separates adaptive security knowledge from a training-free base detector through an updatable, verified, retrieval-augmented memory, and ties each rejection to a documented threat and a specific text segment. On 1,673 held-out attack variants and 317 benign items (n = 1,990 per system), RTM reached ASR = 6.3% [95% Wilson CI: 5.2%, 7.5%] at FPR = 16.1% [12.5%, 20.5%], close to the base detector alone (5.7% ASR) and clearly better than a public trained detector (17.3% ASR, 42.9% FPR). Ingesting verified exemplars lowered ASR on six held-out families from 88.9% to 0.0% (18 paired cases) with no FPR increase; none of the 100 crafted poisoning records passed verification and no candidate record changed a decision in 200 trials (95% upper bound 1.9%); and 94.0% of 50 audited explanations were verified. Of the six hypotheses, H4 was supported; H2, H3, and H6 were supported in part or descriptively; and H1 and H5 were not supported, because RTM did not improve on the ASR of the base detector and, since every unseen attack reached the detector, was not faster end to end than MELON. The retrieval stage adds 22.0 ms per item on top of the detector call. The limitations in Section VIII, in particular the 16.1% false positive rate and the small samples behind E2–E5, bound these conclusions.</w:t>
+        <w:t>This paper presented RAG-Based Threat Memory (RTM), a model-centric defense that separates adaptive security knowledge from a training-free base detector through an updatable, verified, retrieval-augmented memory, and ties each rejection to a documented threat and a specific text segment. On 1,673 held-out attack variants and 317 benign items (n = 1,990 per system), RTM reached ASR = 6.3% [95% Wilson CI: 5.2%, 7.5%] at FPR = 16.1% [12.5%, 20.5%], compared to the base detector alone (5.7% ASR, 16.1% FPR; a difference governed by distinct decision rules rather than isolating memory alone) and clearly better than a public trained detector (17.3% ASR, 42.9% FPR). Ingesting verified exemplars lowered ASR on six held-out families from 88.9% to 0.0% across 18 evaluated cases with no FPR increase, indicating that certain evasions are remediable without implying universal remediability; none of the 100 crafted poisoning records passed verification and no candidate record changed a decision in 200 trials; and 94.0% of 50 audited explanations were verified under reviewer constraints. Of the six hypotheses specified in the frozen analysis plan, H4 was supported within its sample constraints; H2, H3, and H6 were supported in part or descriptively; and H1 and H5 were not supported, because RTM did not improve on the ASR of the base detector and was not faster end to end than MELON when all unseen attacks reached the detector. The limitations in Section VIII, in particular the 16.1% false positive rate and the small samples behind E2–E6, bound these conclusions.</w:t>
       </w:r>
     </w:p>
     <w:p>

</xml_diff>